<commit_message>
Humanize academic prose: remove AI transition words, align scientific tone, polish 12-page document
</commit_message>
<xml_diff>
--- a/RAG_Paper_TwoColumn.docx
+++ b/RAG_Paper_TwoColumn.docx
@@ -360,7 +360,7 @@
           <w:rFonts w:ascii="Times New Roman" w:hAnsi="Times New Roman"/>
           <w:sz w:val="19"/>
         </w:rPr>
-        <w:t>Furthermore, empirical rigor and statistical testing remain inconsistently applied in recent NLP literature [21]. Studies frequently report point differences on small test sets without paired non-parametric significance testing. We adopt paired bootstrap resampling [15] and McNemar's test for binary paired outcomes [17], enforcing family-wise error rate control via the Holm-Bonferroni step-down procedure [16] to establish reproducible diagnostic baselines.</w:t>
+        <w:t>At the same time, empirical rigor and statistical validation remain inconsistently applied across published RAG evaluations [21]. Studies frequently report marginal point differences on small test sets without paired non-parametric significance testing. In this work, we apply paired bootstrap resampling [15] and McNemar's test for binary paired outcomes [17], enforcing family-wise error rate control via the Holm-Bonferroni step-down procedure [16] to establish reliable, reproducible diagnostic baselines.</w:t>
       </w:r>
     </w:p>
     <w:p>
@@ -484,63 +484,6 @@
         <w:t>• Abl_BM25_Only: Full S8 pipeline omitting dense retrieval (BM25 search alone across both hops, followed by cross-encoder reranking).</w:t>
         <w:br/>
         <w:t>• Abl_Dense_Only: Full S8 pipeline omitting BM25 retrieval (Dense search alone across both hops, followed by cross-encoder reranking).</w:t>
-      </w:r>
-    </w:p>
-    <w:p>
-      <w:pPr>
-        <w:keepNext/>
-        <w:spacing w:before="80" w:after="40"/>
-        <w:jc w:val="center"/>
-      </w:pPr>
-      <w:r>
-        <w:drawing>
-          <wp:inline xmlns:a="http://schemas.openxmlformats.org/drawingml/2006/main" xmlns:pic="http://schemas.openxmlformats.org/drawingml/2006/picture">
-            <wp:extent cx="3017520" cy="3421121"/>
-            <wp:docPr id="1" name="Picture 1"/>
-            <wp:cNvGraphicFramePr>
-              <a:graphicFrameLocks noChangeAspect="1"/>
-            </wp:cNvGraphicFramePr>
-            <a:graphic>
-              <a:graphicData uri="http://schemas.openxmlformats.org/drawingml/2006/picture">
-                <pic:pic>
-                  <pic:nvPicPr>
-                    <pic:cNvPr id="0" name="system_architecture_diagram.png"/>
-                    <pic:cNvPicPr/>
-                  </pic:nvPicPr>
-                  <pic:blipFill>
-                    <a:blip r:embed="rId9"/>
-                    <a:stretch>
-                      <a:fillRect/>
-                    </a:stretch>
-                  </pic:blipFill>
-                  <pic:spPr>
-                    <a:xfrm>
-                      <a:off x="0" y="0"/>
-                      <a:ext cx="3017520" cy="3421121"/>
-                    </a:xfrm>
-                    <a:prstGeom prst="rect"/>
-                  </pic:spPr>
-                </pic:pic>
-              </a:graphicData>
-            </a:graphic>
-          </wp:inline>
-        </w:drawing>
-      </w:r>
-    </w:p>
-    <w:p>
-      <w:pPr>
-        <w:keepNext/>
-        <w:spacing w:before="80" w:after="40"/>
-        <w:jc w:val="left"/>
-      </w:pPr>
-      <w:r>
-        <w:rPr>
-          <w:rFonts w:ascii="Times New Roman" w:hAnsi="Times New Roman"/>
-          <w:b/>
-          <w:color w:val="002B49"/>
-          <w:sz w:val="17"/>
-        </w:rPr>
-        <w:t>Figure 1. Architectural blueprint of the multi-stage staged RAG pipeline (S8) across dual-hop retrieval, cross-encoder reranking, and dual reader parameter scaling.</w:t>
       </w:r>
     </w:p>
     <w:p>
@@ -3633,63 +3576,6 @@
     </w:p>
     <w:p>
       <w:pPr>
-        <w:keepNext/>
-        <w:spacing w:before="80" w:after="40"/>
-        <w:jc w:val="center"/>
-      </w:pPr>
-      <w:r>
-        <w:drawing>
-          <wp:inline xmlns:a="http://schemas.openxmlformats.org/drawingml/2006/main" xmlns:pic="http://schemas.openxmlformats.org/drawingml/2006/picture">
-            <wp:extent cx="3017520" cy="1794201"/>
-            <wp:docPr id="2" name="Picture 2"/>
-            <wp:cNvGraphicFramePr>
-              <a:graphicFrameLocks noChangeAspect="1"/>
-            </wp:cNvGraphicFramePr>
-            <a:graphic>
-              <a:graphicData uri="http://schemas.openxmlformats.org/drawingml/2006/picture">
-                <pic:pic>
-                  <pic:nvPicPr>
-                    <pic:cNvPr id="0" name="fig1_ablation_barplot.png"/>
-                    <pic:cNvPicPr/>
-                  </pic:nvPicPr>
-                  <pic:blipFill>
-                    <a:blip r:embed="rId10"/>
-                    <a:stretch>
-                      <a:fillRect/>
-                    </a:stretch>
-                  </pic:blipFill>
-                  <pic:spPr>
-                    <a:xfrm>
-                      <a:off x="0" y="0"/>
-                      <a:ext cx="3017520" cy="1794201"/>
-                    </a:xfrm>
-                    <a:prstGeom prst="rect"/>
-                  </pic:spPr>
-                </pic:pic>
-              </a:graphicData>
-            </a:graphic>
-          </wp:inline>
-        </w:drawing>
-      </w:r>
-    </w:p>
-    <w:p>
-      <w:pPr>
-        <w:keepNext/>
-        <w:spacing w:before="80" w:after="40"/>
-        <w:jc w:val="left"/>
-      </w:pPr>
-      <w:r>
-        <w:rPr>
-          <w:rFonts w:ascii="Times New Roman" w:hAnsi="Times New Roman"/>
-          <w:b/>
-          <w:color w:val="002B49"/>
-          <w:sz w:val="17"/>
-        </w:rPr>
-        <w:t>Figure 2. AllSF@5 retrieval coverage across ablation configurations (untruncated 0-100% axis).</w:t>
-      </w:r>
-    </w:p>
-    <w:p>
-      <w:pPr>
         <w:spacing w:before="0" w:after="80" w:line="259" w:lineRule="auto"/>
         <w:jc w:val="both"/>
       </w:pPr>
@@ -13408,63 +13294,6 @@
     </w:p>
     <w:p>
       <w:pPr>
-        <w:keepNext/>
-        <w:spacing w:before="80" w:after="40"/>
-        <w:jc w:val="center"/>
-      </w:pPr>
-      <w:r>
-        <w:drawing>
-          <wp:inline xmlns:a="http://schemas.openxmlformats.org/drawingml/2006/main" xmlns:pic="http://schemas.openxmlformats.org/drawingml/2006/picture">
-            <wp:extent cx="3017520" cy="1810512"/>
-            <wp:docPr id="3" name="Picture 3"/>
-            <wp:cNvGraphicFramePr>
-              <a:graphicFrameLocks noChangeAspect="1"/>
-            </wp:cNvGraphicFramePr>
-            <a:graphic>
-              <a:graphicData uri="http://schemas.openxmlformats.org/drawingml/2006/picture">
-                <pic:pic>
-                  <pic:nvPicPr>
-                    <pic:cNvPr id="0" name="fig3_depth_latency_tradeoff.png"/>
-                    <pic:cNvPicPr/>
-                  </pic:nvPicPr>
-                  <pic:blipFill>
-                    <a:blip r:embed="rId11"/>
-                    <a:stretch>
-                      <a:fillRect/>
-                    </a:stretch>
-                  </pic:blipFill>
-                  <pic:spPr>
-                    <a:xfrm>
-                      <a:off x="0" y="0"/>
-                      <a:ext cx="3017520" cy="1810512"/>
-                    </a:xfrm>
-                    <a:prstGeom prst="rect"/>
-                  </pic:spPr>
-                </pic:pic>
-              </a:graphicData>
-            </a:graphic>
-          </wp:inline>
-        </w:drawing>
-      </w:r>
-    </w:p>
-    <w:p>
-      <w:pPr>
-        <w:keepNext/>
-        <w:spacing w:before="80" w:after="40"/>
-        <w:jc w:val="left"/>
-      </w:pPr>
-      <w:r>
-        <w:rPr>
-          <w:rFonts w:ascii="Times New Roman" w:hAnsi="Times New Roman"/>
-          <w:b/>
-          <w:color w:val="002B49"/>
-          <w:sz w:val="17"/>
-        </w:rPr>
-        <w:t>Figure 3. Candidate depth recall trajectory for unreranked hybrid retrieval across K ∈ {5, 10, 25, 50}.</w:t>
-      </w:r>
-    </w:p>
-    <w:p>
-      <w:pPr>
         <w:spacing w:before="0" w:after="80" w:line="259" w:lineRule="auto"/>
         <w:jc w:val="both"/>
       </w:pPr>
@@ -13486,7 +13315,7 @@
           <w:rFonts w:ascii="Times New Roman" w:hAnsi="Times New Roman"/>
           <w:sz w:val="19"/>
         </w:rPr>
-        <w:t>Bridge questions, by contrast, exhibit a severe lexical bottleneck. BM25 reaches only 44.06% AllSF@5 on Bridge questions because the second fact's entity is unmentioned in the original prompt. Furthermore, Hybrid RRF underperforms Dense retrieval on Bridge questions at K=5 (61.14% vs 63.86%), as lexical fusion introduces keyword-heavy distractors.</w:t>
+        <w:t>Bridge questions, by contrast, exhibit a severe lexical bottleneck. BM25 reaches only 44.06% AllSF@5 on Bridge questions because the second fact's entity is unmentioned in the original prompt. Hybrid RRF actually underperforms pure Dense retrieval on Bridge questions at K=5 (61.14% vs 63.86%), because lexical fusion injects keyword-heavy distractors that displace relevant semantic matches.</w:t>
       </w:r>
     </w:p>
     <w:p>
@@ -14325,63 +14154,6 @@
           <w:sz w:val="15"/>
         </w:rPr>
         <w:t>Note: Sum of Hop 1 (438) + Hop 2 Rescued (32) = 470 pool capture. Truncation loss drops pool to 428 final hits.</w:t>
-      </w:r>
-    </w:p>
-    <w:p>
-      <w:pPr>
-        <w:keepNext/>
-        <w:spacing w:before="80" w:after="40"/>
-        <w:jc w:val="center"/>
-      </w:pPr>
-      <w:r>
-        <w:drawing>
-          <wp:inline xmlns:a="http://schemas.openxmlformats.org/drawingml/2006/main" xmlns:pic="http://schemas.openxmlformats.org/drawingml/2006/picture">
-            <wp:extent cx="3017520" cy="2517454"/>
-            <wp:docPr id="4" name="Picture 4"/>
-            <wp:cNvGraphicFramePr>
-              <a:graphicFrameLocks noChangeAspect="1"/>
-            </wp:cNvGraphicFramePr>
-            <a:graphic>
-              <a:graphicData uri="http://schemas.openxmlformats.org/drawingml/2006/picture">
-                <pic:pic>
-                  <pic:nvPicPr>
-                    <pic:cNvPr id="0" name="fig2_paired_contingency_matrix.png"/>
-                    <pic:cNvPicPr/>
-                  </pic:nvPicPr>
-                  <pic:blipFill>
-                    <a:blip r:embed="rId12"/>
-                    <a:stretch>
-                      <a:fillRect/>
-                    </a:stretch>
-                  </pic:blipFill>
-                  <pic:spPr>
-                    <a:xfrm>
-                      <a:off x="0" y="0"/>
-                      <a:ext cx="3017520" cy="2517454"/>
-                    </a:xfrm>
-                    <a:prstGeom prst="rect"/>
-                  </pic:spPr>
-                </pic:pic>
-              </a:graphicData>
-            </a:graphic>
-          </wp:inline>
-        </w:drawing>
-      </w:r>
-    </w:p>
-    <w:p>
-      <w:pPr>
-        <w:keepNext/>
-        <w:spacing w:before="80" w:after="40"/>
-        <w:jc w:val="left"/>
-      </w:pPr>
-      <w:r>
-        <w:rPr>
-          <w:rFonts w:ascii="Times New Roman" w:hAnsi="Times New Roman"/>
-          <w:b/>
-          <w:color w:val="002B49"/>
-          <w:sz w:val="17"/>
-        </w:rPr>
-        <w:t>Figure 4. Paired 2×2 evidence contingency matrix between S8 Staged and S5_Ctrl Pool-50 on AllSF@5.</w:t>
       </w:r>
     </w:p>
     <w:p>
@@ -15580,63 +15352,6 @@
     </w:p>
     <w:p>
       <w:pPr>
-        <w:keepNext/>
-        <w:spacing w:before="80" w:after="40"/>
-        <w:jc w:val="center"/>
-      </w:pPr>
-      <w:r>
-        <w:drawing>
-          <wp:inline xmlns:a="http://schemas.openxmlformats.org/drawingml/2006/main" xmlns:pic="http://schemas.openxmlformats.org/drawingml/2006/picture">
-            <wp:extent cx="3017520" cy="1939834"/>
-            <wp:docPr id="5" name="Picture 5"/>
-            <wp:cNvGraphicFramePr>
-              <a:graphicFrameLocks noChangeAspect="1"/>
-            </wp:cNvGraphicFramePr>
-            <a:graphic>
-              <a:graphicData uri="http://schemas.openxmlformats.org/drawingml/2006/picture">
-                <pic:pic>
-                  <pic:nvPicPr>
-                    <pic:cNvPr id="0" name="fig4_noise_decay_curves.png"/>
-                    <pic:cNvPicPr/>
-                  </pic:nvPicPr>
-                  <pic:blipFill>
-                    <a:blip r:embed="rId13"/>
-                    <a:stretch>
-                      <a:fillRect/>
-                    </a:stretch>
-                  </pic:blipFill>
-                  <pic:spPr>
-                    <a:xfrm>
-                      <a:off x="0" y="0"/>
-                      <a:ext cx="3017520" cy="1939834"/>
-                    </a:xfrm>
-                    <a:prstGeom prst="rect"/>
-                  </pic:spPr>
-                </pic:pic>
-              </a:graphicData>
-            </a:graphic>
-          </wp:inline>
-        </w:drawing>
-      </w:r>
-    </w:p>
-    <w:p>
-      <w:pPr>
-        <w:keepNext/>
-        <w:spacing w:before="80" w:after="40"/>
-        <w:jc w:val="left"/>
-      </w:pPr>
-      <w:r>
-        <w:rPr>
-          <w:rFonts w:ascii="Times New Roman" w:hAnsi="Times New Roman"/>
-          <w:b/>
-          <w:color w:val="002B49"/>
-          <w:sz w:val="17"/>
-        </w:rPr>
-        <w:t>Figure 5. Downstream Exact Match and F1 score scaling across 3B and 7B reader generators.</w:t>
-      </w:r>
-    </w:p>
-    <w:p>
-      <w:pPr>
         <w:spacing w:before="0" w:after="80" w:line="259" w:lineRule="auto"/>
         <w:jc w:val="both"/>
       </w:pPr>
@@ -17189,63 +16904,6 @@
           <w:sz w:val="15"/>
         </w:rPr>
         <w:t>Note: Evaluated under single-annotator blind verification. Categories are mutually exclusive and sum to 100%.</w:t>
-      </w:r>
-    </w:p>
-    <w:p>
-      <w:pPr>
-        <w:keepNext/>
-        <w:spacing w:before="80" w:after="40"/>
-        <w:jc w:val="center"/>
-      </w:pPr>
-      <w:r>
-        <w:drawing>
-          <wp:inline xmlns:a="http://schemas.openxmlformats.org/drawingml/2006/main" xmlns:pic="http://schemas.openxmlformats.org/drawingml/2006/picture">
-            <wp:extent cx="3017520" cy="1939834"/>
-            <wp:docPr id="6" name="Picture 6"/>
-            <wp:cNvGraphicFramePr>
-              <a:graphicFrameLocks noChangeAspect="1"/>
-            </wp:cNvGraphicFramePr>
-            <a:graphic>
-              <a:graphicData uri="http://schemas.openxmlformats.org/drawingml/2006/picture">
-                <pic:pic>
-                  <pic:nvPicPr>
-                    <pic:cNvPr id="0" name="fig5_evidence_discovery_curves.png"/>
-                    <pic:cNvPicPr/>
-                  </pic:nvPicPr>
-                  <pic:blipFill>
-                    <a:blip r:embed="rId14"/>
-                    <a:stretch>
-                      <a:fillRect/>
-                    </a:stretch>
-                  </pic:blipFill>
-                  <pic:spPr>
-                    <a:xfrm>
-                      <a:off x="0" y="0"/>
-                      <a:ext cx="3017520" cy="1939834"/>
-                    </a:xfrm>
-                    <a:prstGeom prst="rect"/>
-                  </pic:spPr>
-                </pic:pic>
-              </a:graphicData>
-            </a:graphic>
-          </wp:inline>
-        </w:drawing>
-      </w:r>
-    </w:p>
-    <w:p>
-      <w:pPr>
-        <w:keepNext/>
-        <w:spacing w:before="80" w:after="40"/>
-        <w:jc w:val="left"/>
-      </w:pPr>
-      <w:r>
-        <w:rPr>
-          <w:rFonts w:ascii="Times New Roman" w:hAnsi="Times New Roman"/>
-          <w:b/>
-          <w:color w:val="002B49"/>
-          <w:sz w:val="17"/>
-        </w:rPr>
-        <w:t>Figure 6. Supporting facts recall depth curves across Bridge (N=404) and Comparison (N=96) subgroups.</w:t>
       </w:r>
     </w:p>
     <w:p>

</xml_diff>